<commit_message>
docs: manual técnico con las secciones del panel
</commit_message>
<xml_diff>
--- a/docs/para-drive/Manual técnico.docx
+++ b/docs/para-drive/Manual técnico.docx
@@ -1562,7 +1562,7 @@
               <w:t xml:space="preserve"> </w:t>
             </w:r>
             <w:r>
-              <w:t xml:space="preserve">las monta,</w:t>
+              <w:t xml:space="preserve">las monta y tiene Inicio,</w:t>
             </w:r>
             <w:r>
               <w:t xml:space="preserve"> </w:t>
@@ -1577,7 +1577,7 @@
               <w:t xml:space="preserve"> </w:t>
             </w:r>
             <w:r>
-              <w:t xml:space="preserve">tiene los diálogos y avisos compartidos y cada sección vive en su archivo, por ejemplo</w:t>
+              <w:t xml:space="preserve">tiene los diálogos, avisos y el contador de mensajes, y cada sección vive en su archivo:</w:t>
             </w:r>
             <w:r>
               <w:t xml:space="preserve"> </w:t>
@@ -1589,7 +1589,25 @@
               <w:t xml:space="preserve">panel-agenda.js</w:t>
             </w:r>
             <w:r>
-              <w:t xml:space="preserve">)</w:t>
+              <w:t xml:space="preserve"> </w:t>
+            </w:r>
+            <w:r>
+              <w:t xml:space="preserve">(agenda por día, búsqueda de pacientes y acciones) y</w:t>
+            </w:r>
+            <w:r>
+              <w:t xml:space="preserve"> </w:t>
+            </w:r>
+            <w:r>
+              <w:rPr>
+                <w:rStyle w:val="VerbatimChar"/>
+              </w:rPr>
+              <w:t xml:space="preserve">panel-mensajes.js</w:t>
+            </w:r>
+            <w:r>
+              <w:t xml:space="preserve"> </w:t>
+            </w:r>
+            <w:r>
+              <w:t xml:space="preserve">(WhatsApp por enviar, enviados, con error y recordatorios de mañana))</w:t>
             </w:r>
           </w:p>
         </w:tc>

</xml_diff>

<commit_message>
docs: sección de disponibilidad en el manual técnico
</commit_message>
<xml_diff>
--- a/docs/para-drive/Manual técnico.docx
+++ b/docs/para-drive/Manual técnico.docx
@@ -1592,7 +1592,22 @@
               <w:t xml:space="preserve"> </w:t>
             </w:r>
             <w:r>
-              <w:t xml:space="preserve">(agenda por día, búsqueda de pacientes y acciones) y</w:t>
+              <w:t xml:space="preserve">(agenda por día, búsqueda de pacientes y acciones),</w:t>
+            </w:r>
+            <w:r>
+              <w:t xml:space="preserve"> </w:t>
+            </w:r>
+            <w:r>
+              <w:rPr>
+                <w:rStyle w:val="VerbatimChar"/>
+              </w:rPr>
+              <w:t xml:space="preserve">panel-disponibilidad.js</w:t>
+            </w:r>
+            <w:r>
+              <w:t xml:space="preserve"> </w:t>
+            </w:r>
+            <w:r>
+              <w:t xml:space="preserve">(semana por especialista: publicar horas en varios días a la vez y quitar horas libres) y</w:t>
             </w:r>
             <w:r>
               <w:t xml:space="preserve"> </w:t>

</xml_diff>